<commit_message>
Add guide details to the project report
Co-Authored-By: Claude Opus 5.5 <noreply@anthropic.com>
</commit_message>
<xml_diff>
--- a/report/BLE_Attendance_Project_Report.docx
+++ b/report/BLE_Attendance_Project_Report.docx
@@ -128,7 +128,7 @@
           <w:sz w:val="26"/>
           <w:szCs w:val="26"/>
         </w:rPr>
-        <w:t xml:space="preserve">[Guide Name]</w:t>
+        <w:t xml:space="preserve">Dr. Lalitha K.</w:t>
       </w:r>
     </w:p>
     <w:p>
@@ -142,7 +142,7 @@
           <w:sz w:val="22"/>
           <w:szCs w:val="22"/>
         </w:rPr>
-        <w:t xml:space="preserve">([Designation], Department of Computer Science and Engineering)</w:t>
+        <w:t xml:space="preserve">(Assistant Professor, Department of Electronics and Communication Engineering)</w:t>
       </w:r>
     </w:p>
     <w:p>
@@ -442,7 +442,7 @@
                 <w:sz w:val="24"/>
                 <w:szCs w:val="24"/>
               </w:rPr>
-              <w:t xml:space="preserve">[Guide Name]</w:t>
+              <w:t xml:space="preserve">Dr. Lalitha K.</w:t>
             </w:r>
           </w:p>
           <w:p>
@@ -457,7 +457,7 @@
                 <w:sz w:val="24"/>
                 <w:szCs w:val="24"/>
               </w:rPr>
-              <w:t xml:space="preserve">[Designation]</w:t>
+              <w:t xml:space="preserve">Assistant Professor</w:t>
             </w:r>
           </w:p>
           <w:p>
@@ -472,7 +472,7 @@
                 <w:sz w:val="24"/>
                 <w:szCs w:val="24"/>
               </w:rPr>
-              <w:t xml:space="preserve">Computer Science and Engineering,</w:t>
+              <w:t xml:space="preserve">Electronics and Communication Engineering,</w:t>
             </w:r>
           </w:p>
           <w:p>
@@ -714,7 +714,7 @@
           <w:sz w:val="24"/>
           <w:szCs w:val="24"/>
         </w:rPr>
-        <w:t xml:space="preserve">We hereby declare that the entire work contained in this project report titled “BLE-BASED PROXIMITY ATTENDANCE SYSTEM WITH BIOMETRIC VERIFICATION” has been carried out by ADITYA KUMAR NATH [REG NO: RA2411003020203], ABHISHEK S [REG NO: RA2411003020208] and GOVIND GOEL [REG NO: RA2411003020215] at SRM Institute of Science and Technology, Ramapuram Campus, Chennai - 600089, under the guidance of [Guide Name], [Designation], Department of Computer Science and Engineering.</w:t>
+        <w:t xml:space="preserve">We hereby declare that the entire work contained in this project report titled “BLE-BASED PROXIMITY ATTENDANCE SYSTEM WITH BIOMETRIC VERIFICATION” has been carried out by ADITYA KUMAR NATH [REG NO: RA2411003020203], ABHISHEK S [REG NO: RA2411003020208] and GOVIND GOEL [REG NO: RA2411003020215] at SRM Institute of Science and Technology, Ramapuram Campus, Chennai - 600089, under the guidance of Dr. Lalitha K., Assistant Professor, Department of Electronics and Communication Engineering.</w:t>
       </w:r>
     </w:p>
     <w:p/>

</xml_diff>